<commit_message>
Expand chapter 2 series introduction into publishable prologue
</commit_message>
<xml_diff>
--- a/최종_전체_연구_패키지/연구_자료_전체_설명서.docx
+++ b/최종_전체_연구_패키지/연구_자료_전체_설명서.docx
@@ -206,6 +206,86 @@
                 <w:sz w:val="20"/>
               </w:rPr>
               <w:t>사용할 때</w:t>
+            </w:r>
+          </w:p>
+        </w:tc>
+      </w:tr>
+      <w:tr>
+        <w:tc>
+          <w:tcPr>
+            <w:tcW w:type="dxa" w:w="4896"/>
+            <w:tcMar>
+              <w:top w:w="80" w:type="dxa"/>
+              <w:start w:w="120" w:type="dxa"/>
+              <w:bottom w:w="80" w:type="dxa"/>
+              <w:end w:w="120" w:type="dxa"/>
+            </w:tcMar>
+            <w:vAlign w:val="center"/>
+          </w:tcPr>
+          <w:p>
+            <w:pPr>
+              <w:spacing w:after="0"/>
+              <w:jc w:val="left"/>
+            </w:pPr>
+            <w:r>
+              <w:rPr>
+                <w:rFonts w:ascii="Malgun Gothic" w:hAnsi="Malgun Gothic" w:eastAsia="Malgun Gothic"/>
+                <w:b w:val="0"/>
+                <w:sz w:val="20"/>
+              </w:rPr>
+              <w:t>문병로_교수의_메트릭_스튜디오_02_00_블로그_게시용.docx</w:t>
+            </w:r>
+          </w:p>
+        </w:tc>
+        <w:tc>
+          <w:tcPr>
+            <w:tcW w:type="dxa" w:w="2232"/>
+            <w:tcMar>
+              <w:top w:w="80" w:type="dxa"/>
+              <w:start w:w="120" w:type="dxa"/>
+              <w:bottom w:w="80" w:type="dxa"/>
+              <w:end w:w="120" w:type="dxa"/>
+            </w:tcMar>
+            <w:vAlign w:val="center"/>
+          </w:tcPr>
+          <w:p>
+            <w:pPr>
+              <w:spacing w:after="0"/>
+              <w:jc w:val="center"/>
+            </w:pPr>
+            <w:r>
+              <w:rPr>
+                <w:rFonts w:ascii="Malgun Gothic" w:hAnsi="Malgun Gothic" w:eastAsia="Malgun Gothic"/>
+                <w:b w:val="0"/>
+                <w:sz w:val="20"/>
+              </w:rPr>
+              <w:t>0편 완성 원고. 1장의 문제의식에서 2장의 네 가지 실험 질문으로 넘어가는 글이다.</w:t>
+            </w:r>
+          </w:p>
+        </w:tc>
+        <w:tc>
+          <w:tcPr>
+            <w:tcW w:type="dxa" w:w="1728"/>
+            <w:tcMar>
+              <w:top w:w="80" w:type="dxa"/>
+              <w:start w:w="120" w:type="dxa"/>
+              <w:bottom w:w="80" w:type="dxa"/>
+              <w:end w:w="120" w:type="dxa"/>
+            </w:tcMar>
+            <w:vAlign w:val="center"/>
+          </w:tcPr>
+          <w:p>
+            <w:pPr>
+              <w:spacing w:after="0"/>
+              <w:jc w:val="center"/>
+            </w:pPr>
+            <w:r>
+              <w:rPr>
+                <w:rFonts w:ascii="Malgun Gothic" w:hAnsi="Malgun Gothic" w:eastAsia="Malgun Gothic"/>
+                <w:b w:val="0"/>
+                <w:sz w:val="20"/>
+              </w:rPr>
+              <w:t>0편을 게시할 때</w:t>
             </w:r>
           </w:p>
         </w:tc>
@@ -553,7 +633,7 @@
                 <w:b w:val="0"/>
                 <w:sz w:val="20"/>
               </w:rPr>
-              <w:t>문병로_교수의_메트릭_스튜디오_02_01부터_04_블로그_게시용.docx</w:t>
+              <w:t>문병로_교수의_메트릭_스튜디오_02_00부터_04_블로그_게시용.docx</w:t>
             </w:r>
           </w:p>
         </w:tc>
@@ -579,7 +659,7 @@
                 <w:b w:val="0"/>
                 <w:sz w:val="20"/>
               </w:rPr>
-              <w:t>1~4편을 순서대로 읽는 합본.</w:t>
+              <w:t>0~4편을 순서대로 읽는 합본.</w:t>
             </w:r>
           </w:p>
         </w:tc>
@@ -1434,7 +1514,7 @@
                 <w:b w:val="0"/>
                 <w:sz w:val="20"/>
               </w:rPr>
-              <w:t>1편</w:t>
+              <w:t>0편·1편</w:t>
             </w:r>
           </w:p>
         </w:tc>
@@ -1649,7 +1729,7 @@
                 <w:b w:val="0"/>
                 <w:sz w:val="20"/>
               </w:rPr>
-              <w:t>1장 글에서 2장 연재로 넘어가는 문제의식과 네 편의 질문.</w:t>
+              <w:t>1장 글에서 2장 연재로 넘어가는 문제의식과 네 가지 실험 질문.</w:t>
             </w:r>
           </w:p>
         </w:tc>

</xml_diff>